<commit_message>
P6 / Mission 1 : publier la version a jour des livrables
Les quatre documents publies dataient du 6 aout. Ils ne contenaient ni
les figures, ni le RACI, ni les contraintes classees par origine, ni les
ressources, ni les jalons dates, ni la matrice des risques, ni le critere
de sobriete, ni les sources datees avec liens, ni la tracabilite des
essais IA, ni les sommaires, ni la section formation refaite.

Ajout d'un README du dossier : ce qui a change et pourquoi, les resultats
mesures, la marche a suivre pour reproduire, et les limites assumees.

Co-Authored-By: Claude Opus 5 <noreply@anthropic.com>
</commit_message>
<xml_diff>
--- a/p06-qualite-donnees-boutique/mission1-amelioration-ia/PROJET_ORGANISATION.docx
+++ b/p06-qualite-donnees-boutique/mission1-amelioration-ia/PROJET_ORGANISATION.docx
@@ -99,8 +99,137 @@
           <w:sz w:val="18"/>
           <w:szCs w:val="18"/>
         </w:rPr>
-        <w:t xml:space="preserve">   ·   Formation Data Analyst — OpenClassrooms   ·   Juillet 2026</w:t>
+        <w:t xml:space="preserve">   ·   Formation Data Analyst — OpenClassrooms   ·   Août 2026</w:t>
       </w:r>
+    </w:p>
+    <w:p>
+      <w:pPr>
+        <w:spacing w:after="130" w:before="60"/>
+      </w:pPr>
+      <w:r>
+        <w:rPr>
+          <w:rFonts w:ascii="Calibri" w:cs="Calibri" w:eastAsia="Calibri" w:hAnsi="Calibri"/>
+          <w:b/>
+          <w:bCs/>
+          <w:color w:val="134652"/>
+          <w:spacing w:val="25"/>
+          <w:sz w:val="17"/>
+          <w:szCs w:val="17"/>
+        </w:rPr>
+        <w:t xml:space="preserve">SOMMAIRE</w:t>
+      </w:r>
+    </w:p>
+    <w:p>
+      <w:pPr>
+        <w:tabs>
+          <w:tab w:val="right" w:pos="9200"/>
+        </w:tabs>
+        <w:spacing w:after="70"/>
+      </w:pPr>
+      <w:r>
+        <w:rPr>
+          <w:rFonts w:ascii="Consolas" w:cs="Consolas" w:eastAsia="Consolas" w:hAnsi="Consolas"/>
+          <w:color w:val="E8622C"/>
+          <w:sz w:val="17"/>
+          <w:szCs w:val="17"/>
+        </w:rPr>
+        <w:t xml:space="preserve">01   </w:t>
+      </w:r>
+      <w:r>
+        <w:rPr>
+          <w:rFonts w:ascii="Calibri" w:cs="Calibri" w:eastAsia="Calibri" w:hAnsi="Calibri"/>
+          <w:color w:val="222222"/>
+          <w:sz w:val="19"/>
+          <w:szCs w:val="19"/>
+        </w:rPr>
+        <w:t xml:space="preserve">Découpage en lots</w:t>
+      </w:r>
+    </w:p>
+    <w:p>
+      <w:pPr>
+        <w:tabs>
+          <w:tab w:val="right" w:pos="9200"/>
+        </w:tabs>
+        <w:spacing w:after="70"/>
+      </w:pPr>
+      <w:r>
+        <w:rPr>
+          <w:rFonts w:ascii="Consolas" w:cs="Consolas" w:eastAsia="Consolas" w:hAnsi="Consolas"/>
+          <w:color w:val="E8622C"/>
+          <w:sz w:val="17"/>
+          <w:szCs w:val="17"/>
+        </w:rPr>
+        <w:t xml:space="preserve">02   </w:t>
+      </w:r>
+      <w:r>
+        <w:rPr>
+          <w:rFonts w:ascii="Calibri" w:cs="Calibri" w:eastAsia="Calibri" w:hAnsi="Calibri"/>
+          <w:color w:val="222222"/>
+          <w:sz w:val="19"/>
+          <w:szCs w:val="19"/>
+        </w:rPr>
+        <w:t xml:space="preserve">Backlog de tâches</w:t>
+      </w:r>
+    </w:p>
+    <w:p>
+      <w:pPr>
+        <w:tabs>
+          <w:tab w:val="right" w:pos="9200"/>
+        </w:tabs>
+        <w:spacing w:after="70"/>
+      </w:pPr>
+      <w:r>
+        <w:rPr>
+          <w:rFonts w:ascii="Consolas" w:cs="Consolas" w:eastAsia="Consolas" w:hAnsi="Consolas"/>
+          <w:color w:val="E8622C"/>
+          <w:sz w:val="17"/>
+          <w:szCs w:val="17"/>
+        </w:rPr>
+        <w:t xml:space="preserve">03   </w:t>
+      </w:r>
+      <w:r>
+        <w:rPr>
+          <w:rFonts w:ascii="Calibri" w:cs="Calibri" w:eastAsia="Calibri" w:hAnsi="Calibri"/>
+          <w:color w:val="222222"/>
+          <w:sz w:val="19"/>
+          <w:szCs w:val="19"/>
+        </w:rPr>
+        <w:t xml:space="preserve">Planning et jalons</w:t>
+      </w:r>
+    </w:p>
+    <w:p>
+      <w:pPr>
+        <w:tabs>
+          <w:tab w:val="right" w:pos="9200"/>
+        </w:tabs>
+        <w:spacing w:after="70"/>
+      </w:pPr>
+      <w:r>
+        <w:rPr>
+          <w:rFonts w:ascii="Consolas" w:cs="Consolas" w:eastAsia="Consolas" w:hAnsi="Consolas"/>
+          <w:color w:val="E8622C"/>
+          <w:sz w:val="17"/>
+          <w:szCs w:val="17"/>
+        </w:rPr>
+        <w:t xml:space="preserve">04   </w:t>
+      </w:r>
+      <w:r>
+        <w:rPr>
+          <w:rFonts w:ascii="Calibri" w:cs="Calibri" w:eastAsia="Calibri" w:hAnsi="Calibri"/>
+          <w:color w:val="222222"/>
+          <w:sz w:val="19"/>
+          <w:szCs w:val="19"/>
+        </w:rPr>
+        <w:t xml:space="preserve">Registre des risques</w:t>
+      </w:r>
+    </w:p>
+    <w:p>
+      <w:pPr>
+        <w:pBdr>
+          <w:bottom w:val="single" w:color="1F7A8C" w:sz="6" w:space="10"/>
+        </w:pBdr>
+        <w:spacing w:after="340"/>
+      </w:pPr>
     </w:p>
     <w:p>
       <w:pPr>
@@ -141,6 +270,7 @@
       </w:tblGrid>
       <w:tr>
         <w:trPr>
+          <w:cantSplit/>
           <w:tblHeader/>
         </w:trPr>
         <w:tc>
@@ -223,6 +353,9 @@
         </w:tc>
       </w:tr>
       <w:tr>
+        <w:trPr>
+          <w:cantSplit/>
+        </w:trPr>
         <w:tc>
           <w:tcPr>
             <w:tcW w:type="dxa" w:w="2400"/>
@@ -300,6 +433,9 @@
         </w:tc>
       </w:tr>
       <w:tr>
+        <w:trPr>
+          <w:cantSplit/>
+        </w:trPr>
         <w:tc>
           <w:tcPr>
             <w:tcW w:type="dxa" w:w="2400"/>
@@ -380,6 +516,9 @@
         </w:tc>
       </w:tr>
       <w:tr>
+        <w:trPr>
+          <w:cantSplit/>
+        </w:trPr>
         <w:tc>
           <w:tcPr>
             <w:tcW w:type="dxa" w:w="2400"/>
@@ -457,6 +596,9 @@
         </w:tc>
       </w:tr>
       <w:tr>
+        <w:trPr>
+          <w:cantSplit/>
+        </w:trPr>
         <w:tc>
           <w:tcPr>
             <w:tcW w:type="dxa" w:w="2400"/>
@@ -505,7 +647,7 @@
                 <w:sz w:val="19"/>
                 <w:szCs w:val="19"/>
               </w:rPr>
-              <w:t xml:space="preserve">Enrichir l'analyse univariée par une détection d'anomalies multivariée et une validation statistique</w:t>
+              <w:t xml:space="preserve">Enrichir l'analyse univariée par deux méthodes de détection d'anomalies multivariée et une validation statistique</w:t>
             </w:r>
           </w:p>
         </w:tc>
@@ -537,6 +679,9 @@
         </w:tc>
       </w:tr>
       <w:tr>
+        <w:trPr>
+          <w:cantSplit/>
+        </w:trPr>
         <w:tc>
           <w:tcPr>
             <w:tcW w:type="dxa" w:w="2400"/>
@@ -583,7 +728,7 @@
                 <w:sz w:val="19"/>
                 <w:szCs w:val="19"/>
               </w:rPr>
-              <w:t xml:space="preserve">Corriger la portabilité, éliminer le code mort, exécuter le notebook sans erreur</w:t>
+              <w:t xml:space="preserve">Corriger la portabilité (chemins relatifs), exécuter le notebook sans erreur</w:t>
             </w:r>
           </w:p>
         </w:tc>
@@ -614,6 +759,9 @@
         </w:tc>
       </w:tr>
       <w:tr>
+        <w:trPr>
+          <w:cantSplit/>
+        </w:trPr>
         <w:tc>
           <w:tcPr>
             <w:tcW w:type="dxa" w:w="2400"/>
@@ -662,7 +810,7 @@
                 <w:sz w:val="19"/>
                 <w:szCs w:val="19"/>
               </w:rPr>
-              <w:t xml:space="preserve">Documenter les choix, les limites et produire une synthèse exploitable en soutenance</w:t>
+              <w:t xml:space="preserve">Documenter les choix, les limites et produire une synthèse exploitable par les équipes métier</w:t>
             </w:r>
           </w:p>
         </w:tc>
@@ -735,6 +883,7 @@
       </w:tblGrid>
       <w:tr>
         <w:trPr>
+          <w:cantSplit/>
           <w:tblHeader/>
         </w:trPr>
         <w:tc>
@@ -869,6 +1018,9 @@
         </w:tc>
       </w:tr>
       <w:tr>
+        <w:trPr>
+          <w:cantSplit/>
+        </w:trPr>
         <w:tc>
           <w:tcPr>
             <w:tcW w:type="dxa" w:w="3400"/>
@@ -996,6 +1148,9 @@
         </w:tc>
       </w:tr>
       <w:tr>
+        <w:trPr>
+          <w:cantSplit/>
+        </w:trPr>
         <w:tc>
           <w:tcPr>
             <w:tcW w:type="dxa" w:w="3400"/>
@@ -1128,6 +1283,9 @@
         </w:tc>
       </w:tr>
       <w:tr>
+        <w:trPr>
+          <w:cantSplit/>
+        </w:trPr>
         <w:tc>
           <w:tcPr>
             <w:tcW w:type="dxa" w:w="3400"/>
@@ -1255,6 +1413,9 @@
         </w:tc>
       </w:tr>
       <w:tr>
+        <w:trPr>
+          <w:cantSplit/>
+        </w:trPr>
         <w:tc>
           <w:tcPr>
             <w:tcW w:type="dxa" w:w="3400"/>
@@ -1277,7 +1438,7 @@
                 <w:sz w:val="19"/>
                 <w:szCs w:val="19"/>
               </w:rPr>
-              <w:t xml:space="preserve">Créer la copie V2, corriger les chemins</w:t>
+              <w:t xml:space="preserve">Corriger les chemins absolus du V1 en chemins relatifs</w:t>
             </w:r>
           </w:p>
         </w:tc>
@@ -1387,6 +1548,9 @@
         </w:tc>
       </w:tr>
       <w:tr>
+        <w:trPr>
+          <w:cantSplit/>
+        </w:trPr>
         <w:tc>
           <w:tcPr>
             <w:tcW w:type="dxa" w:w="3400"/>
@@ -1408,7 +1572,7 @@
                 <w:sz w:val="19"/>
                 <w:szCs w:val="19"/>
               </w:rPr>
-              <w:t xml:space="preserve">Éliminer le code mort (valorisation stock)</w:t>
+              <w:t xml:space="preserve">Implémenter et exécuter Isolation Forest</w:t>
             </w:r>
           </w:p>
         </w:tc>
@@ -1433,7 +1597,7 @@
                 <w:sz w:val="19"/>
                 <w:szCs w:val="19"/>
               </w:rPr>
-              <w:t xml:space="preserve">15 min</w:t>
+              <w:t xml:space="preserve">1h30</w:t>
             </w:r>
           </w:p>
         </w:tc>
@@ -1458,7 +1622,7 @@
                 <w:sz w:val="19"/>
                 <w:szCs w:val="19"/>
               </w:rPr>
-              <w:t xml:space="preserve">Copie V2 créée</w:t>
+              <w:t xml:space="preserve">Veille</w:t>
             </w:r>
           </w:p>
         </w:tc>
@@ -1483,7 +1647,7 @@
                 <w:sz w:val="19"/>
                 <w:szCs w:val="19"/>
               </w:rPr>
-              <w:t xml:space="preserve">Ligne redondante supprimée, résultat inchangé</w:t>
+              <w:t xml:space="preserve">Section exécutable, résultats réels obtenus</w:t>
             </w:r>
           </w:p>
         </w:tc>
@@ -1514,6 +1678,9 @@
         </w:tc>
       </w:tr>
       <w:tr>
+        <w:trPr>
+          <w:cantSplit/>
+        </w:trPr>
         <w:tc>
           <w:tcPr>
             <w:tcW w:type="dxa" w:w="3400"/>
@@ -1536,7 +1703,7 @@
                 <w:sz w:val="19"/>
                 <w:szCs w:val="19"/>
               </w:rPr>
-              <w:t xml:space="preserve">Implémenter la section Isolation Forest</w:t>
+              <w:t xml:space="preserve">Implémenter et exécuter Local Outlier Factor (2e méthode, comparaison réelle)</w:t>
             </w:r>
           </w:p>
         </w:tc>
@@ -1562,7 +1729,7 @@
                 <w:sz w:val="19"/>
                 <w:szCs w:val="19"/>
               </w:rPr>
-              <w:t xml:space="preserve">2h</w:t>
+              <w:t xml:space="preserve">1h</w:t>
             </w:r>
           </w:p>
         </w:tc>
@@ -1588,7 +1755,7 @@
                 <w:sz w:val="19"/>
                 <w:szCs w:val="19"/>
               </w:rPr>
-              <w:t xml:space="preserve">Copie V2, veille</w:t>
+              <w:t xml:space="preserve">Isolation Forest en place</w:t>
             </w:r>
           </w:p>
         </w:tc>
@@ -1614,7 +1781,7 @@
                 <w:sz w:val="19"/>
                 <w:szCs w:val="19"/>
               </w:rPr>
-              <w:t xml:space="preserve">Section exécutable, recouvrement calculé et visualisé</w:t>
+              <w:t xml:space="preserve">Résultats réels comparés à l'IQR et à Isolation Forest</w:t>
             </w:r>
           </w:p>
         </w:tc>
@@ -1646,6 +1813,9 @@
         </w:tc>
       </w:tr>
       <w:tr>
+        <w:trPr>
+          <w:cantSplit/>
+        </w:trPr>
         <w:tc>
           <w:tcPr>
             <w:tcW w:type="dxa" w:w="3400"/>
@@ -1667,7 +1837,7 @@
                 <w:sz w:val="19"/>
                 <w:szCs w:val="19"/>
               </w:rPr>
-              <w:t xml:space="preserve">Implémenter les tests de significativité</w:t>
+              <w:t xml:space="preserve">Mesurer et comparer les temps de calcul des deux méthodes</w:t>
             </w:r>
           </w:p>
         </w:tc>
@@ -1692,7 +1862,7 @@
                 <w:sz w:val="19"/>
                 <w:szCs w:val="19"/>
               </w:rPr>
-              <w:t xml:space="preserve">1h30</w:t>
+              <w:t xml:space="preserve">20 min</w:t>
             </w:r>
           </w:p>
         </w:tc>
@@ -1717,7 +1887,7 @@
                 <w:sz w:val="19"/>
                 <w:szCs w:val="19"/>
               </w:rPr>
-              <w:t xml:space="preserve">Copie V2, heatmap</w:t>
+              <w:t xml:space="preserve">Les deux méthodes implémentées</w:t>
             </w:r>
           </w:p>
         </w:tc>
@@ -1742,7 +1912,7 @@
                 <w:sz w:val="19"/>
                 <w:szCs w:val="19"/>
               </w:rPr>
-              <w:t xml:space="preserve">Table Pearson + Spearman + p-value</w:t>
+              <w:t xml:space="preserve">Temps mesurés, pas estimés</w:t>
             </w:r>
           </w:p>
         </w:tc>
@@ -1773,6 +1943,9 @@
         </w:tc>
       </w:tr>
       <w:tr>
+        <w:trPr>
+          <w:cantSplit/>
+        </w:trPr>
         <w:tc>
           <w:tcPr>
             <w:tcW w:type="dxa" w:w="3400"/>
@@ -1795,7 +1968,7 @@
                 <w:sz w:val="19"/>
                 <w:szCs w:val="19"/>
               </w:rPr>
-              <w:t xml:space="preserve">Ajouter la cellule de résumé V1 → V2</w:t>
+              <w:t xml:space="preserve">Implémenter les tests de significativité (Pearson + Spearman)</w:t>
             </w:r>
           </w:p>
         </w:tc>
@@ -1821,7 +1994,7 @@
                 <w:sz w:val="19"/>
                 <w:szCs w:val="19"/>
               </w:rPr>
-              <w:t xml:space="preserve">15 min</w:t>
+              <w:t xml:space="preserve">1h</w:t>
             </w:r>
           </w:p>
         </w:tc>
@@ -1847,7 +2020,7 @@
                 <w:sz w:val="19"/>
                 <w:szCs w:val="19"/>
               </w:rPr>
-              <w:t xml:space="preserve">Sections V2 en place</w:t>
+              <w:t xml:space="preserve">Heatmap V1</w:t>
             </w:r>
           </w:p>
         </w:tc>
@@ -1873,7 +2046,7 @@
                 <w:sz w:val="19"/>
                 <w:szCs w:val="19"/>
               </w:rPr>
-              <w:t xml:space="preserve">Cellule markdown en tête de notebook</w:t>
+              <w:t xml:space="preserve">Table Pearson + Spearman + p-value, calculée réellement</w:t>
             </w:r>
           </w:p>
         </w:tc>
@@ -1905,6 +2078,9 @@
         </w:tc>
       </w:tr>
       <w:tr>
+        <w:trPr>
+          <w:cantSplit/>
+        </w:trPr>
         <w:tc>
           <w:tcPr>
             <w:tcW w:type="dxa" w:w="3400"/>
@@ -1926,7 +2102,7 @@
                 <w:sz w:val="19"/>
                 <w:szCs w:val="19"/>
               </w:rPr>
-              <w:t xml:space="preserve">Diagnostiquer et corriger un bug de formatage bloquant l'exécution (17 cellules)</w:t>
+              <w:t xml:space="preserve">Exécution complète du notebook (Run All)</w:t>
             </w:r>
           </w:p>
         </w:tc>
@@ -1951,7 +2127,7 @@
                 <w:sz w:val="19"/>
                 <w:szCs w:val="19"/>
               </w:rPr>
-              <w:t xml:space="preserve">45 min</w:t>
+              <w:t xml:space="preserve">20 min</w:t>
             </w:r>
           </w:p>
         </w:tc>
@@ -1976,7 +2152,7 @@
                 <w:sz w:val="19"/>
                 <w:szCs w:val="19"/>
               </w:rPr>
-              <w:t xml:space="preserve">—</w:t>
+              <w:t xml:space="preserve">Toutes les sections en place</w:t>
             </w:r>
           </w:p>
         </w:tc>
@@ -2001,7 +2177,7 @@
                 <w:sz w:val="19"/>
                 <w:szCs w:val="19"/>
               </w:rPr>
-              <w:t xml:space="preserve">0 cellule en erreur sur un Run All complet</w:t>
+              <w:t xml:space="preserve">0 erreur sur 94 cellules</w:t>
             </w:r>
           </w:p>
         </w:tc>
@@ -2032,6 +2208,9 @@
         </w:tc>
       </w:tr>
       <w:tr>
+        <w:trPr>
+          <w:cantSplit/>
+        </w:trPr>
         <w:tc>
           <w:tcPr>
             <w:tcW w:type="dxa" w:w="3400"/>
@@ -2054,7 +2233,7 @@
                 <w:sz w:val="19"/>
                 <w:szCs w:val="19"/>
               </w:rPr>
-              <w:t xml:space="preserve">Environnement Python reproductible + exécution</w:t>
+              <w:t xml:space="preserve">Rédiger les conclusions à partir des résultats réellement obtenus</w:t>
             </w:r>
           </w:p>
         </w:tc>
@@ -2106,7 +2285,7 @@
                 <w:sz w:val="19"/>
                 <w:szCs w:val="19"/>
               </w:rPr>
-              <w:t xml:space="preserve">Bug corrigé</w:t>
+              <w:t xml:space="preserve">Exécution réussie</w:t>
             </w:r>
           </w:p>
         </w:tc>
@@ -2132,7 +2311,7 @@
                 <w:sz w:val="19"/>
                 <w:szCs w:val="19"/>
               </w:rPr>
-              <w:t xml:space="preserve">nbconvert --execute termine sans erreur</w:t>
+              <w:t xml:space="preserve">Chiffres reportés dans README, identiques aux sorties du notebook</w:t>
             </w:r>
           </w:p>
         </w:tc>
@@ -2164,6 +2343,9 @@
         </w:tc>
       </w:tr>
       <w:tr>
+        <w:trPr>
+          <w:cantSplit/>
+        </w:trPr>
         <w:tc>
           <w:tcPr>
             <w:tcW w:type="dxa" w:w="3400"/>
@@ -2185,7 +2367,7 @@
                 <w:sz w:val="19"/>
                 <w:szCs w:val="19"/>
               </w:rPr>
-              <w:t xml:space="preserve">Extraire les résultats numériques réels et corriger les écarts avec le brouillon initial</w:t>
+              <w:t xml:space="preserve">Rédiger PROJET_ORGANISATION.docx</w:t>
             </w:r>
           </w:p>
         </w:tc>
@@ -2210,7 +2392,7 @@
                 <w:sz w:val="19"/>
                 <w:szCs w:val="19"/>
               </w:rPr>
-              <w:t xml:space="preserve">30 min</w:t>
+              <w:t xml:space="preserve">45 min</w:t>
             </w:r>
           </w:p>
         </w:tc>
@@ -2235,7 +2417,7 @@
                 <w:sz w:val="19"/>
                 <w:szCs w:val="19"/>
               </w:rPr>
-              <w:t xml:space="preserve">Exécution réussie</w:t>
+              <w:t xml:space="preserve">Lots et backlog définis</w:t>
             </w:r>
           </w:p>
         </w:tc>
@@ -2260,7 +2442,7 @@
                 <w:sz w:val="19"/>
                 <w:szCs w:val="19"/>
               </w:rPr>
-              <w:t xml:space="preserve">Chiffres reportés dans README, cohérents avec les sorties du notebook</w:t>
+              <w:t xml:space="preserve">Document complet</w:t>
             </w:r>
           </w:p>
         </w:tc>
@@ -2291,6 +2473,9 @@
         </w:tc>
       </w:tr>
       <w:tr>
+        <w:trPr>
+          <w:cantSplit/>
+        </w:trPr>
         <w:tc>
           <w:tcPr>
             <w:tcW w:type="dxa" w:w="3400"/>
@@ -2313,7 +2498,7 @@
                 <w:sz w:val="19"/>
                 <w:szCs w:val="19"/>
               </w:rPr>
-              <w:t xml:space="preserve">Rédiger PROJET_ORGANISATION.md</w:t>
+              <w:t xml:space="preserve">Rédiger README.docx final</w:t>
             </w:r>
           </w:p>
         </w:tc>
@@ -2365,7 +2550,7 @@
                 <w:sz w:val="19"/>
                 <w:szCs w:val="19"/>
               </w:rPr>
-              <w:t xml:space="preserve">Lots et backlog définis</w:t>
+              <w:t xml:space="preserve">Résultats numériques disponibles</w:t>
             </w:r>
           </w:p>
         </w:tc>
@@ -2391,7 +2576,7 @@
                 <w:sz w:val="19"/>
                 <w:szCs w:val="19"/>
               </w:rPr>
-              <w:t xml:space="preserve">Document complet</w:t>
+              <w:t xml:space="preserve">Traçabilité, limites, synthèse avec chiffres réels</w:t>
             </w:r>
           </w:p>
         </w:tc>
@@ -2423,6 +2608,9 @@
         </w:tc>
       </w:tr>
       <w:tr>
+        <w:trPr>
+          <w:cantSplit/>
+        </w:trPr>
         <w:tc>
           <w:tcPr>
             <w:tcW w:type="dxa" w:w="3400"/>
@@ -2444,7 +2632,7 @@
                 <w:sz w:val="19"/>
                 <w:szCs w:val="19"/>
               </w:rPr>
-              <w:t xml:space="preserve">Rédiger README.md final</w:t>
+              <w:t xml:space="preserve">Explorer une détection par sous-famille de produits (itération future)</w:t>
             </w:r>
           </w:p>
         </w:tc>
@@ -2469,7 +2657,7 @@
                 <w:sz w:val="19"/>
                 <w:szCs w:val="19"/>
               </w:rPr>
-              <w:t xml:space="preserve">1h</w:t>
+              <w:t xml:space="preserve">2h (estimé)</w:t>
             </w:r>
           </w:p>
         </w:tc>
@@ -2494,266 +2682,7 @@
                 <w:sz w:val="19"/>
                 <w:szCs w:val="19"/>
               </w:rPr>
-              <w:t xml:space="preserve">Résultats numériques disponibles</w:t>
-            </w:r>
-          </w:p>
-        </w:tc>
-        <w:tc>
-          <w:tcPr>
-            <w:tcW w:type="dxa" w:w="2620"/>
-            <w:tcMar>
-              <w:top w:type="dxa" w:w="90"/>
-              <w:left w:type="dxa" w:w="130"/>
-              <w:bottom w:type="dxa" w:w="90"/>
-              <w:right w:type="dxa" w:w="130"/>
-            </w:tcMar>
-            <w:vAlign w:val="center"/>
-          </w:tcPr>
-          <w:p>
-            <w:r>
-              <w:rPr>
-                <w:rFonts w:ascii="Calibri" w:cs="Calibri" w:eastAsia="Calibri" w:hAnsi="Calibri"/>
-                <w:b w:val="false"/>
-                <w:bCs w:val="false"/>
-                <w:color w:val="222222"/>
-                <w:sz w:val="19"/>
-                <w:szCs w:val="19"/>
-              </w:rPr>
-              <w:t xml:space="preserve">Traçabilité, limites, synthèse avec chiffres réels</w:t>
-            </w:r>
-          </w:p>
-        </w:tc>
-        <w:tc>
-          <w:tcPr>
-            <w:tcW w:type="dxa" w:w="1100"/>
-            <w:tcMar>
-              <w:top w:type="dxa" w:w="90"/>
-              <w:left w:type="dxa" w:w="130"/>
-              <w:bottom w:type="dxa" w:w="90"/>
-              <w:right w:type="dxa" w:w="130"/>
-            </w:tcMar>
-            <w:vAlign w:val="center"/>
-          </w:tcPr>
-          <w:p>
-            <w:r>
-              <w:rPr>
-                <w:rFonts w:ascii="Calibri" w:cs="Calibri" w:eastAsia="Calibri" w:hAnsi="Calibri"/>
-                <w:b w:val="false"/>
-                <w:bCs w:val="false"/>
-                <w:color w:val="222222"/>
-                <w:sz w:val="19"/>
-                <w:szCs w:val="19"/>
-              </w:rPr>
-              <w:t xml:space="preserve">✅ Fait</w:t>
-            </w:r>
-          </w:p>
-        </w:tc>
-      </w:tr>
-      <w:tr>
-        <w:tc>
-          <w:tcPr>
-            <w:tcW w:type="dxa" w:w="3400"/>
-            <w:shd w:fill="EDEFF1" w:color="auto" w:val="clear"/>
-            <w:tcMar>
-              <w:top w:type="dxa" w:w="90"/>
-              <w:left w:type="dxa" w:w="130"/>
-              <w:bottom w:type="dxa" w:w="90"/>
-              <w:right w:type="dxa" w:w="130"/>
-            </w:tcMar>
-            <w:vAlign w:val="center"/>
-          </w:tcPr>
-          <w:p>
-            <w:r>
-              <w:rPr>
-                <w:rFonts w:ascii="Calibri" w:cs="Calibri" w:eastAsia="Calibri" w:hAnsi="Calibri"/>
-                <w:b w:val="false"/>
-                <w:bCs w:val="false"/>
-                <w:color w:val="222222"/>
-                <w:sz w:val="19"/>
-                <w:szCs w:val="19"/>
-              </w:rPr>
-              <w:t xml:space="preserve">Explorer LOF (itération future)</w:t>
-            </w:r>
-          </w:p>
-        </w:tc>
-        <w:tc>
-          <w:tcPr>
-            <w:tcW w:type="dxa" w:w="1000"/>
-            <w:shd w:fill="EDEFF1" w:color="auto" w:val="clear"/>
-            <w:tcMar>
-              <w:top w:type="dxa" w:w="90"/>
-              <w:left w:type="dxa" w:w="130"/>
-              <w:bottom w:type="dxa" w:w="90"/>
-              <w:right w:type="dxa" w:w="130"/>
-            </w:tcMar>
-            <w:vAlign w:val="center"/>
-          </w:tcPr>
-          <w:p>
-            <w:r>
-              <w:rPr>
-                <w:rFonts w:ascii="Calibri" w:cs="Calibri" w:eastAsia="Calibri" w:hAnsi="Calibri"/>
-                <w:b w:val="false"/>
-                <w:bCs w:val="false"/>
-                <w:color w:val="222222"/>
-                <w:sz w:val="19"/>
-                <w:szCs w:val="19"/>
-              </w:rPr>
-              <w:t xml:space="preserve">2h (estimé)</w:t>
-            </w:r>
-          </w:p>
-        </w:tc>
-        <w:tc>
-          <w:tcPr>
-            <w:tcW w:type="dxa" w:w="1500"/>
-            <w:shd w:fill="EDEFF1" w:color="auto" w:val="clear"/>
-            <w:tcMar>
-              <w:top w:type="dxa" w:w="90"/>
-              <w:left w:type="dxa" w:w="130"/>
-              <w:bottom w:type="dxa" w:w="90"/>
-              <w:right w:type="dxa" w:w="130"/>
-            </w:tcMar>
-            <w:vAlign w:val="center"/>
-          </w:tcPr>
-          <w:p>
-            <w:r>
-              <w:rPr>
-                <w:rFonts w:ascii="Calibri" w:cs="Calibri" w:eastAsia="Calibri" w:hAnsi="Calibri"/>
-                <w:b w:val="false"/>
-                <w:bCs w:val="false"/>
-                <w:color w:val="222222"/>
-                <w:sz w:val="19"/>
-                <w:szCs w:val="19"/>
-              </w:rPr>
-              <w:t xml:space="preserve">Résultats Isolation Forest</w:t>
-            </w:r>
-          </w:p>
-        </w:tc>
-        <w:tc>
-          <w:tcPr>
-            <w:tcW w:type="dxa" w:w="2620"/>
-            <w:shd w:fill="EDEFF1" w:color="auto" w:val="clear"/>
-            <w:tcMar>
-              <w:top w:type="dxa" w:w="90"/>
-              <w:left w:type="dxa" w:w="130"/>
-              <w:bottom w:type="dxa" w:w="90"/>
-              <w:right w:type="dxa" w:w="130"/>
-            </w:tcMar>
-            <w:vAlign w:val="center"/>
-          </w:tcPr>
-          <w:p>
-            <w:r>
-              <w:rPr>
-                <w:rFonts w:ascii="Calibri" w:cs="Calibri" w:eastAsia="Calibri" w:hAnsi="Calibri"/>
-                <w:b w:val="false"/>
-                <w:bCs w:val="false"/>
-                <w:color w:val="222222"/>
-                <w:sz w:val="19"/>
-                <w:szCs w:val="19"/>
-              </w:rPr>
-              <w:t xml:space="preserve">Non démarré</w:t>
-            </w:r>
-          </w:p>
-        </w:tc>
-        <w:tc>
-          <w:tcPr>
-            <w:tcW w:type="dxa" w:w="1100"/>
-            <w:shd w:fill="EDEFF1" w:color="auto" w:val="clear"/>
-            <w:tcMar>
-              <w:top w:type="dxa" w:w="90"/>
-              <w:left w:type="dxa" w:w="130"/>
-              <w:bottom w:type="dxa" w:w="90"/>
-              <w:right w:type="dxa" w:w="130"/>
-            </w:tcMar>
-            <w:vAlign w:val="center"/>
-          </w:tcPr>
-          <w:p>
-            <w:r>
-              <w:rPr>
-                <w:rFonts w:ascii="Calibri" w:cs="Calibri" w:eastAsia="Calibri" w:hAnsi="Calibri"/>
-                <w:b w:val="false"/>
-                <w:bCs w:val="false"/>
-                <w:color w:val="222222"/>
-                <w:sz w:val="19"/>
-                <w:szCs w:val="19"/>
-              </w:rPr>
-              <w:t xml:space="preserve">🔲 À faire</w:t>
-            </w:r>
-          </w:p>
-        </w:tc>
-      </w:tr>
-      <w:tr>
-        <w:tc>
-          <w:tcPr>
-            <w:tcW w:type="dxa" w:w="3400"/>
-            <w:tcMar>
-              <w:top w:type="dxa" w:w="90"/>
-              <w:left w:type="dxa" w:w="130"/>
-              <w:bottom w:type="dxa" w:w="90"/>
-              <w:right w:type="dxa" w:w="130"/>
-            </w:tcMar>
-            <w:vAlign w:val="center"/>
-          </w:tcPr>
-          <w:p>
-            <w:r>
-              <w:rPr>
-                <w:rFonts w:ascii="Calibri" w:cs="Calibri" w:eastAsia="Calibri" w:hAnsi="Calibri"/>
-                <w:b w:val="false"/>
-                <w:bCs w:val="false"/>
-                <w:color w:val="222222"/>
-                <w:sz w:val="19"/>
-                <w:szCs w:val="19"/>
-              </w:rPr>
-              <w:t xml:space="preserve">Test automatisé sur la valorisation stock</w:t>
-            </w:r>
-          </w:p>
-        </w:tc>
-        <w:tc>
-          <w:tcPr>
-            <w:tcW w:type="dxa" w:w="1000"/>
-            <w:tcMar>
-              <w:top w:type="dxa" w:w="90"/>
-              <w:left w:type="dxa" w:w="130"/>
-              <w:bottom w:type="dxa" w:w="90"/>
-              <w:right w:type="dxa" w:w="130"/>
-            </w:tcMar>
-            <w:vAlign w:val="center"/>
-          </w:tcPr>
-          <w:p>
-            <w:r>
-              <w:rPr>
-                <w:rFonts w:ascii="Calibri" w:cs="Calibri" w:eastAsia="Calibri" w:hAnsi="Calibri"/>
-                <w:b w:val="false"/>
-                <w:bCs w:val="false"/>
-                <w:color w:val="222222"/>
-                <w:sz w:val="19"/>
-                <w:szCs w:val="19"/>
-              </w:rPr>
-              <w:t xml:space="preserve">30 min (estimé)</w:t>
-            </w:r>
-          </w:p>
-        </w:tc>
-        <w:tc>
-          <w:tcPr>
-            <w:tcW w:type="dxa" w:w="1500"/>
-            <w:tcMar>
-              <w:top w:type="dxa" w:w="90"/>
-              <w:left w:type="dxa" w:w="130"/>
-              <w:bottom w:type="dxa" w:w="90"/>
-              <w:right w:type="dxa" w:w="130"/>
-            </w:tcMar>
-            <w:vAlign w:val="center"/>
-          </w:tcPr>
-          <w:p>
-            <w:r>
-              <w:rPr>
-                <w:rFonts w:ascii="Calibri" w:cs="Calibri" w:eastAsia="Calibri" w:hAnsi="Calibri"/>
-                <w:b w:val="false"/>
-                <w:bCs w:val="false"/>
-                <w:color w:val="222222"/>
-                <w:sz w:val="19"/>
-                <w:szCs w:val="19"/>
-              </w:rPr>
-              <w:t xml:space="preserve">Notebook V2 stabilisé</w:t>
+              <w:t xml:space="preserve">Résultats Local Outlier Factor</w:t>
             </w:r>
           </w:p>
         </w:tc>
@@ -2842,7 +2771,7 @@
           <w:sz w:val="21"/>
           <w:szCs w:val="21"/>
         </w:rPr>
-        <w:t xml:space="preserve">~12h.   </w:t>
+        <w:t xml:space="preserve">~11h.   </w:t>
       </w:r>
       <w:r>
         <w:rPr>
@@ -2868,7 +2797,7 @@
           <w:sz w:val="21"/>
           <w:szCs w:val="21"/>
         </w:rPr>
-        <w:t xml:space="preserve">~2h30.</w:t>
+        <w:t xml:space="preserve">~2h.</w:t>
       </w:r>
     </w:p>
     <w:p>
@@ -2891,6 +2820,24 @@
         <w:t xml:space="preserve">3. Planning et jalons</w:t>
       </w:r>
     </w:p>
+    <w:p>
+      <w:pPr>
+        <w:spacing w:after="160" w:line="300"/>
+      </w:pPr>
+      <w:r>
+        <w:rPr>
+          <w:rFonts w:ascii="Calibri" w:cs="Calibri" w:eastAsia="Calibri" w:hAnsi="Calibri"/>
+          <w:b w:val="false"/>
+          <w:bCs w:val="false"/>
+          <w:i w:val="false"/>
+          <w:iCs w:val="false"/>
+          <w:color w:val="222222"/>
+          <w:sz w:val="21"/>
+          <w:szCs w:val="21"/>
+        </w:rPr>
+        <w:t xml:space="preserve">Projet lancé le 26 juin 2026, livré le 17 juillet 2026 : 3 semaines calendaires pour environ 11 heures de charge effective, réparties en soirées et demi-journées.</w:t>
+      </w:r>
+    </w:p>
     <w:tbl>
       <w:tblPr>
         <w:tblW w:type="dxa" w:w="9648"/>
@@ -2904,17 +2851,19 @@
         </w:tblBorders>
       </w:tblPr>
       <w:tblGrid>
-        <w:gridCol w:w="2600"/>
-        <w:gridCol w:w="3800"/>
-        <w:gridCol w:w="3220"/>
+        <w:gridCol w:w="1250"/>
+        <w:gridCol w:w="2350"/>
+        <w:gridCol w:w="3200"/>
+        <w:gridCol w:w="2820"/>
       </w:tblGrid>
       <w:tr>
         <w:trPr>
+          <w:cantSplit/>
           <w:tblHeader/>
         </w:trPr>
         <w:tc>
           <w:tcPr>
-            <w:tcW w:type="dxa" w:w="2600"/>
+            <w:tcW w:type="dxa" w:w="1250"/>
             <w:shd w:fill="134652" w:color="auto" w:val="clear"/>
             <w:tcMar>
               <w:top w:type="dxa" w:w="90"/>
@@ -2934,13 +2883,13 @@
                 <w:sz w:val="19"/>
                 <w:szCs w:val="19"/>
               </w:rPr>
-              <w:t xml:space="preserve">Jalon</w:t>
-            </w:r>
-          </w:p>
-        </w:tc>
-        <w:tc>
-          <w:tcPr>
-            <w:tcW w:type="dxa" w:w="3800"/>
+              <w:t xml:space="preserve">Date</w:t>
+            </w:r>
+          </w:p>
+        </w:tc>
+        <w:tc>
+          <w:tcPr>
+            <w:tcW w:type="dxa" w:w="2350"/>
             <w:shd w:fill="134652" w:color="auto" w:val="clear"/>
             <w:tcMar>
               <w:top w:type="dxa" w:w="90"/>
@@ -2960,13 +2909,13 @@
                 <w:sz w:val="19"/>
                 <w:szCs w:val="19"/>
               </w:rPr>
-              <w:t xml:space="preserve">Contenu</w:t>
-            </w:r>
-          </w:p>
-        </w:tc>
-        <w:tc>
-          <w:tcPr>
-            <w:tcW w:type="dxa" w:w="3220"/>
+              <w:t xml:space="preserve">Jalon</w:t>
+            </w:r>
+          </w:p>
+        </w:tc>
+        <w:tc>
+          <w:tcPr>
+            <w:tcW w:type="dxa" w:w="3200"/>
             <w:shd w:fill="134652" w:color="auto" w:val="clear"/>
             <w:tcMar>
               <w:top w:type="dxa" w:w="90"/>
@@ -2986,250 +2935,497 @@
                 <w:sz w:val="19"/>
                 <w:szCs w:val="19"/>
               </w:rPr>
+              <w:t xml:space="preserve">Contenu</w:t>
+            </w:r>
+          </w:p>
+        </w:tc>
+        <w:tc>
+          <w:tcPr>
+            <w:tcW w:type="dxa" w:w="2820"/>
+            <w:shd w:fill="134652" w:color="auto" w:val="clear"/>
+            <w:tcMar>
+              <w:top w:type="dxa" w:w="90"/>
+              <w:left w:type="dxa" w:w="130"/>
+              <w:bottom w:type="dxa" w:w="90"/>
+              <w:right w:type="dxa" w:w="130"/>
+            </w:tcMar>
+            <w:vAlign w:val="center"/>
+          </w:tcPr>
+          <w:p>
+            <w:r>
+              <w:rPr>
+                <w:rFonts w:ascii="Calibri" w:cs="Calibri" w:eastAsia="Calibri" w:hAnsi="Calibri"/>
+                <w:b/>
+                <w:bCs/>
+                <w:color w:val="FFFFFF"/>
+                <w:sz w:val="19"/>
+                <w:szCs w:val="19"/>
+              </w:rPr>
               <w:t xml:space="preserve">Point de contrôle</w:t>
             </w:r>
           </w:p>
         </w:tc>
       </w:tr>
       <w:tr>
-        <w:tc>
-          <w:tcPr>
-            <w:tcW w:type="dxa" w:w="2600"/>
-            <w:tcMar>
-              <w:top w:type="dxa" w:w="90"/>
-              <w:left w:type="dxa" w:w="130"/>
-              <w:bottom w:type="dxa" w:w="90"/>
-              <w:right w:type="dxa" w:w="130"/>
-            </w:tcMar>
-            <w:vAlign w:val="center"/>
-          </w:tcPr>
-          <w:p>
-            <w:r>
-              <w:rPr>
-                <w:rFonts w:ascii="Calibri" w:cs="Calibri" w:eastAsia="Calibri" w:hAnsi="Calibri"/>
-                <w:b w:val="false"/>
-                <w:bCs w:val="false"/>
-                <w:color w:val="222222"/>
-                <w:sz w:val="19"/>
-                <w:szCs w:val="19"/>
-              </w:rPr>
-              <w:t xml:space="preserve">J1 — Cadrage validé</w:t>
-            </w:r>
-          </w:p>
-        </w:tc>
-        <w:tc>
-          <w:tcPr>
-            <w:tcW w:type="dxa" w:w="3800"/>
-            <w:tcMar>
-              <w:top w:type="dxa" w:w="90"/>
-              <w:left w:type="dxa" w:w="130"/>
-              <w:bottom w:type="dxa" w:w="90"/>
-              <w:right w:type="dxa" w:w="130"/>
-            </w:tcMar>
-            <w:vAlign w:val="center"/>
-          </w:tcPr>
-          <w:p>
-            <w:r>
-              <w:rPr>
-                <w:rFonts w:ascii="Calibri" w:cs="Calibri" w:eastAsia="Calibri" w:hAnsi="Calibri"/>
-                <w:b w:val="false"/>
-                <w:bCs w:val="false"/>
-                <w:color w:val="222222"/>
-                <w:sz w:val="19"/>
-                <w:szCs w:val="19"/>
-              </w:rPr>
-              <w:t xml:space="preserve">Veille technologique + cahier des charges rédigés</w:t>
-            </w:r>
-          </w:p>
-        </w:tc>
-        <w:tc>
-          <w:tcPr>
-            <w:tcW w:type="dxa" w:w="3220"/>
-            <w:tcMar>
-              <w:top w:type="dxa" w:w="90"/>
-              <w:left w:type="dxa" w:w="130"/>
-              <w:bottom w:type="dxa" w:w="90"/>
-              <w:right w:type="dxa" w:w="130"/>
-            </w:tcMar>
-            <w:vAlign w:val="center"/>
-          </w:tcPr>
-          <w:p>
-            <w:r>
-              <w:rPr>
-                <w:rFonts w:ascii="Calibri" w:cs="Calibri" w:eastAsia="Calibri" w:hAnsi="Calibri"/>
-                <w:b w:val="false"/>
-                <w:bCs w:val="false"/>
-                <w:color w:val="222222"/>
-                <w:sz w:val="19"/>
-                <w:szCs w:val="19"/>
-              </w:rPr>
-              <w:t xml:space="preserve">Cohérence entre besoin de veille et limites observées dans le code V1</w:t>
+        <w:trPr>
+          <w:cantSplit/>
+        </w:trPr>
+        <w:tc>
+          <w:tcPr>
+            <w:tcW w:type="dxa" w:w="1250"/>
+            <w:tcMar>
+              <w:top w:type="dxa" w:w="90"/>
+              <w:left w:type="dxa" w:w="130"/>
+              <w:bottom w:type="dxa" w:w="90"/>
+              <w:right w:type="dxa" w:w="130"/>
+            </w:tcMar>
+            <w:vAlign w:val="center"/>
+          </w:tcPr>
+          <w:p>
+            <w:r>
+              <w:rPr>
+                <w:rFonts w:ascii="Calibri" w:cs="Calibri" w:eastAsia="Calibri" w:hAnsi="Calibri"/>
+                <w:b w:val="false"/>
+                <w:bCs w:val="false"/>
+                <w:color w:val="222222"/>
+                <w:sz w:val="19"/>
+                <w:szCs w:val="19"/>
+              </w:rPr>
+              <w:t xml:space="preserve">26 juin</w:t>
+            </w:r>
+          </w:p>
+        </w:tc>
+        <w:tc>
+          <w:tcPr>
+            <w:tcW w:type="dxa" w:w="2350"/>
+            <w:tcMar>
+              <w:top w:type="dxa" w:w="90"/>
+              <w:left w:type="dxa" w:w="130"/>
+              <w:bottom w:type="dxa" w:w="90"/>
+              <w:right w:type="dxa" w:w="130"/>
+            </w:tcMar>
+            <w:vAlign w:val="center"/>
+          </w:tcPr>
+          <w:p>
+            <w:r>
+              <w:rPr>
+                <w:rFonts w:ascii="Calibri" w:cs="Calibri" w:eastAsia="Calibri" w:hAnsi="Calibri"/>
+                <w:b w:val="false"/>
+                <w:bCs w:val="false"/>
+                <w:color w:val="222222"/>
+                <w:sz w:val="19"/>
+                <w:szCs w:val="19"/>
+              </w:rPr>
+              <w:t xml:space="preserve">Lancement</w:t>
+            </w:r>
+          </w:p>
+        </w:tc>
+        <w:tc>
+          <w:tcPr>
+            <w:tcW w:type="dxa" w:w="3200"/>
+            <w:tcMar>
+              <w:top w:type="dxa" w:w="90"/>
+              <w:left w:type="dxa" w:w="130"/>
+              <w:bottom w:type="dxa" w:w="90"/>
+              <w:right w:type="dxa" w:w="130"/>
+            </w:tcMar>
+            <w:vAlign w:val="center"/>
+          </w:tcPr>
+          <w:p>
+            <w:r>
+              <w:rPr>
+                <w:rFonts w:ascii="Calibri" w:cs="Calibri" w:eastAsia="Calibri" w:hAnsi="Calibri"/>
+                <w:b w:val="false"/>
+                <w:bCs w:val="false"/>
+                <w:color w:val="222222"/>
+                <w:sz w:val="19"/>
+                <w:szCs w:val="19"/>
+              </w:rPr>
+              <w:t xml:space="preserve">Analyse du notebook V1, relevé de ses limites, définition du périmètre</w:t>
+            </w:r>
+          </w:p>
+        </w:tc>
+        <w:tc>
+          <w:tcPr>
+            <w:tcW w:type="dxa" w:w="2820"/>
+            <w:tcMar>
+              <w:top w:type="dxa" w:w="90"/>
+              <w:left w:type="dxa" w:w="130"/>
+              <w:bottom w:type="dxa" w:w="90"/>
+              <w:right w:type="dxa" w:w="130"/>
+            </w:tcMar>
+            <w:vAlign w:val="center"/>
+          </w:tcPr>
+          <w:p>
+            <w:r>
+              <w:rPr>
+                <w:rFonts w:ascii="Calibri" w:cs="Calibri" w:eastAsia="Calibri" w:hAnsi="Calibri"/>
+                <w:b w:val="false"/>
+                <w:bCs w:val="false"/>
+                <w:color w:val="222222"/>
+                <w:sz w:val="19"/>
+                <w:szCs w:val="19"/>
+              </w:rPr>
+              <w:t xml:space="preserve">Limites identifiées et rattachées à des lignes de code précises</w:t>
             </w:r>
           </w:p>
         </w:tc>
       </w:tr>
       <w:tr>
-        <w:tc>
-          <w:tcPr>
-            <w:tcW w:type="dxa" w:w="2600"/>
-            <w:shd w:fill="EDEFF1" w:color="auto" w:val="clear"/>
-            <w:tcMar>
-              <w:top w:type="dxa" w:w="90"/>
-              <w:left w:type="dxa" w:w="130"/>
-              <w:bottom w:type="dxa" w:w="90"/>
-              <w:right w:type="dxa" w:w="130"/>
-            </w:tcMar>
-            <w:vAlign w:val="center"/>
-          </w:tcPr>
-          <w:p>
-            <w:r>
-              <w:rPr>
-                <w:rFonts w:ascii="Calibri" w:cs="Calibri" w:eastAsia="Calibri" w:hAnsi="Calibri"/>
-                <w:b w:val="false"/>
-                <w:bCs w:val="false"/>
-                <w:color w:val="222222"/>
-                <w:sz w:val="19"/>
-                <w:szCs w:val="19"/>
-              </w:rPr>
-              <w:t xml:space="preserve">J2 — Notebook V2 fonctionnellement complet</w:t>
-            </w:r>
-          </w:p>
-        </w:tc>
-        <w:tc>
-          <w:tcPr>
-            <w:tcW w:type="dxa" w:w="3800"/>
-            <w:shd w:fill="EDEFF1" w:color="auto" w:val="clear"/>
-            <w:tcMar>
-              <w:top w:type="dxa" w:w="90"/>
-              <w:left w:type="dxa" w:w="130"/>
-              <w:bottom w:type="dxa" w:w="90"/>
-              <w:right w:type="dxa" w:w="130"/>
-            </w:tcMar>
-            <w:vAlign w:val="center"/>
-          </w:tcPr>
-          <w:p>
-            <w:r>
-              <w:rPr>
-                <w:rFonts w:ascii="Calibri" w:cs="Calibri" w:eastAsia="Calibri" w:hAnsi="Calibri"/>
-                <w:b w:val="false"/>
-                <w:bCs w:val="false"/>
-                <w:color w:val="222222"/>
-                <w:sz w:val="19"/>
-                <w:szCs w:val="19"/>
-              </w:rPr>
-              <w:t xml:space="preserve">Corrections de portabilité, suppression du code mort, deux nouvelles sections ajoutées</w:t>
-            </w:r>
-          </w:p>
-        </w:tc>
-        <w:tc>
-          <w:tcPr>
-            <w:tcW w:type="dxa" w:w="3220"/>
-            <w:shd w:fill="EDEFF1" w:color="auto" w:val="clear"/>
-            <w:tcMar>
-              <w:top w:type="dxa" w:w="90"/>
-              <w:left w:type="dxa" w:w="130"/>
-              <w:bottom w:type="dxa" w:w="90"/>
-              <w:right w:type="dxa" w:w="130"/>
-            </w:tcMar>
-            <w:vAlign w:val="center"/>
-          </w:tcPr>
-          <w:p>
-            <w:r>
-              <w:rPr>
-                <w:rFonts w:ascii="Calibri" w:cs="Calibri" w:eastAsia="Calibri" w:hAnsi="Calibri"/>
-                <w:b w:val="false"/>
-                <w:bCs w:val="false"/>
-                <w:color w:val="222222"/>
-                <w:sz w:val="19"/>
-                <w:szCs w:val="19"/>
-              </w:rPr>
-              <w:t xml:space="preserve">Toutes les sections/conclusions V1 conservées à l'identique (diff V1/V2)</w:t>
+        <w:trPr>
+          <w:cantSplit/>
+        </w:trPr>
+        <w:tc>
+          <w:tcPr>
+            <w:tcW w:type="dxa" w:w="1250"/>
+            <w:shd w:fill="EDEFF1" w:color="auto" w:val="clear"/>
+            <w:tcMar>
+              <w:top w:type="dxa" w:w="90"/>
+              <w:left w:type="dxa" w:w="130"/>
+              <w:bottom w:type="dxa" w:w="90"/>
+              <w:right w:type="dxa" w:w="130"/>
+            </w:tcMar>
+            <w:vAlign w:val="center"/>
+          </w:tcPr>
+          <w:p>
+            <w:r>
+              <w:rPr>
+                <w:rFonts w:ascii="Calibri" w:cs="Calibri" w:eastAsia="Calibri" w:hAnsi="Calibri"/>
+                <w:b w:val="false"/>
+                <w:bCs w:val="false"/>
+                <w:color w:val="222222"/>
+                <w:sz w:val="19"/>
+                <w:szCs w:val="19"/>
+              </w:rPr>
+              <w:t xml:space="preserve">10 juillet</w:t>
+            </w:r>
+          </w:p>
+        </w:tc>
+        <w:tc>
+          <w:tcPr>
+            <w:tcW w:type="dxa" w:w="2350"/>
+            <w:shd w:fill="EDEFF1" w:color="auto" w:val="clear"/>
+            <w:tcMar>
+              <w:top w:type="dxa" w:w="90"/>
+              <w:left w:type="dxa" w:w="130"/>
+              <w:bottom w:type="dxa" w:w="90"/>
+              <w:right w:type="dxa" w:w="130"/>
+            </w:tcMar>
+            <w:vAlign w:val="center"/>
+          </w:tcPr>
+          <w:p>
+            <w:r>
+              <w:rPr>
+                <w:rFonts w:ascii="Calibri" w:cs="Calibri" w:eastAsia="Calibri" w:hAnsi="Calibri"/>
+                <w:b w:val="false"/>
+                <w:bCs w:val="false"/>
+                <w:color w:val="222222"/>
+                <w:sz w:val="19"/>
+                <w:szCs w:val="19"/>
+              </w:rPr>
+              <w:t xml:space="preserve">J1 — Cadrage validé</w:t>
+            </w:r>
+          </w:p>
+        </w:tc>
+        <w:tc>
+          <w:tcPr>
+            <w:tcW w:type="dxa" w:w="3200"/>
+            <w:shd w:fill="EDEFF1" w:color="auto" w:val="clear"/>
+            <w:tcMar>
+              <w:top w:type="dxa" w:w="90"/>
+              <w:left w:type="dxa" w:w="130"/>
+              <w:bottom w:type="dxa" w:w="90"/>
+              <w:right w:type="dxa" w:w="130"/>
+            </w:tcMar>
+            <w:vAlign w:val="center"/>
+          </w:tcPr>
+          <w:p>
+            <w:r>
+              <w:rPr>
+                <w:rFonts w:ascii="Calibri" w:cs="Calibri" w:eastAsia="Calibri" w:hAnsi="Calibri"/>
+                <w:b w:val="false"/>
+                <w:bCs w:val="false"/>
+                <w:color w:val="222222"/>
+                <w:sz w:val="19"/>
+                <w:szCs w:val="19"/>
+              </w:rPr>
+              <w:t xml:space="preserve">Veille technologique + cahier des charges rédigés</w:t>
+            </w:r>
+          </w:p>
+        </w:tc>
+        <w:tc>
+          <w:tcPr>
+            <w:tcW w:type="dxa" w:w="2820"/>
+            <w:shd w:fill="EDEFF1" w:color="auto" w:val="clear"/>
+            <w:tcMar>
+              <w:top w:type="dxa" w:w="90"/>
+              <w:left w:type="dxa" w:w="130"/>
+              <w:bottom w:type="dxa" w:w="90"/>
+              <w:right w:type="dxa" w:w="130"/>
+            </w:tcMar>
+            <w:vAlign w:val="center"/>
+          </w:tcPr>
+          <w:p>
+            <w:r>
+              <w:rPr>
+                <w:rFonts w:ascii="Calibri" w:cs="Calibri" w:eastAsia="Calibri" w:hAnsi="Calibri"/>
+                <w:b w:val="false"/>
+                <w:bCs w:val="false"/>
+                <w:color w:val="222222"/>
+                <w:sz w:val="19"/>
+                <w:szCs w:val="19"/>
+              </w:rPr>
+              <w:t xml:space="preserve">Cohérence entre besoin de veille et limites observées dans le code V1</w:t>
             </w:r>
           </w:p>
         </w:tc>
       </w:tr>
       <w:tr>
-        <w:tc>
-          <w:tcPr>
-            <w:tcW w:type="dxa" w:w="2600"/>
-            <w:tcMar>
-              <w:top w:type="dxa" w:w="90"/>
-              <w:left w:type="dxa" w:w="130"/>
-              <w:bottom w:type="dxa" w:w="90"/>
-              <w:right w:type="dxa" w:w="130"/>
-            </w:tcMar>
-            <w:vAlign w:val="center"/>
-          </w:tcPr>
-          <w:p>
-            <w:r>
-              <w:rPr>
-                <w:rFonts w:ascii="Calibri" w:cs="Calibri" w:eastAsia="Calibri" w:hAnsi="Calibri"/>
-                <w:b w:val="false"/>
-                <w:bCs w:val="false"/>
-                <w:color w:val="222222"/>
-                <w:sz w:val="19"/>
-                <w:szCs w:val="19"/>
-              </w:rPr>
-              <w:t xml:space="preserve">J3 — Notebook V2 validé techniquement</w:t>
-            </w:r>
-          </w:p>
-        </w:tc>
-        <w:tc>
-          <w:tcPr>
-            <w:tcW w:type="dxa" w:w="3800"/>
-            <w:tcMar>
-              <w:top w:type="dxa" w:w="90"/>
-              <w:left w:type="dxa" w:w="130"/>
-              <w:bottom w:type="dxa" w:w="90"/>
-              <w:right w:type="dxa" w:w="130"/>
-            </w:tcMar>
-            <w:vAlign w:val="center"/>
-          </w:tcPr>
-          <w:p>
-            <w:r>
-              <w:rPr>
-                <w:rFonts w:ascii="Calibri" w:cs="Calibri" w:eastAsia="Calibri" w:hAnsi="Calibri"/>
-                <w:b w:val="false"/>
-                <w:bCs w:val="false"/>
-                <w:color w:val="222222"/>
-                <w:sz w:val="19"/>
-                <w:szCs w:val="19"/>
-              </w:rPr>
-              <w:t xml:space="preserve">Exécution complète (Run All) sans erreur, environnement reproductible</w:t>
-            </w:r>
-          </w:p>
-        </w:tc>
-        <w:tc>
-          <w:tcPr>
-            <w:tcW w:type="dxa" w:w="3220"/>
-            <w:tcMar>
-              <w:top w:type="dxa" w:w="90"/>
-              <w:left w:type="dxa" w:w="130"/>
-              <w:bottom w:type="dxa" w:w="90"/>
-              <w:right w:type="dxa" w:w="130"/>
-            </w:tcMar>
-            <w:vAlign w:val="center"/>
-          </w:tcPr>
-          <w:p>
-            <w:r>
-              <w:rPr>
-                <w:rFonts w:ascii="Calibri" w:cs="Calibri" w:eastAsia="Calibri" w:hAnsi="Calibri"/>
-                <w:b w:val="false"/>
-                <w:bCs w:val="false"/>
-                <w:color w:val="222222"/>
-                <w:sz w:val="19"/>
-                <w:szCs w:val="19"/>
-              </w:rPr>
-              <w:t xml:space="preserve">Zéro cellule en erreur, chemins relatifs, valorisation vérifiée sur purchase_price</w:t>
+        <w:trPr>
+          <w:cantSplit/>
+        </w:trPr>
+        <w:tc>
+          <w:tcPr>
+            <w:tcW w:type="dxa" w:w="1250"/>
+            <w:tcMar>
+              <w:top w:type="dxa" w:w="90"/>
+              <w:left w:type="dxa" w:w="130"/>
+              <w:bottom w:type="dxa" w:w="90"/>
+              <w:right w:type="dxa" w:w="130"/>
+            </w:tcMar>
+            <w:vAlign w:val="center"/>
+          </w:tcPr>
+          <w:p>
+            <w:r>
+              <w:rPr>
+                <w:rFonts w:ascii="Calibri" w:cs="Calibri" w:eastAsia="Calibri" w:hAnsi="Calibri"/>
+                <w:b w:val="false"/>
+                <w:bCs w:val="false"/>
+                <w:color w:val="222222"/>
+                <w:sz w:val="19"/>
+                <w:szCs w:val="19"/>
+              </w:rPr>
+              <w:t xml:space="preserve">15 juillet</w:t>
+            </w:r>
+          </w:p>
+        </w:tc>
+        <w:tc>
+          <w:tcPr>
+            <w:tcW w:type="dxa" w:w="2350"/>
+            <w:tcMar>
+              <w:top w:type="dxa" w:w="90"/>
+              <w:left w:type="dxa" w:w="130"/>
+              <w:bottom w:type="dxa" w:w="90"/>
+              <w:right w:type="dxa" w:w="130"/>
+            </w:tcMar>
+            <w:vAlign w:val="center"/>
+          </w:tcPr>
+          <w:p>
+            <w:r>
+              <w:rPr>
+                <w:rFonts w:ascii="Calibri" w:cs="Calibri" w:eastAsia="Calibri" w:hAnsi="Calibri"/>
+                <w:b w:val="false"/>
+                <w:bCs w:val="false"/>
+                <w:color w:val="222222"/>
+                <w:sz w:val="19"/>
+                <w:szCs w:val="19"/>
+              </w:rPr>
+              <w:t xml:space="preserve">J2 — Notebook V2 fonctionnellement complet</w:t>
+            </w:r>
+          </w:p>
+        </w:tc>
+        <w:tc>
+          <w:tcPr>
+            <w:tcW w:type="dxa" w:w="3200"/>
+            <w:tcMar>
+              <w:top w:type="dxa" w:w="90"/>
+              <w:left w:type="dxa" w:w="130"/>
+              <w:bottom w:type="dxa" w:w="90"/>
+              <w:right w:type="dxa" w:w="130"/>
+            </w:tcMar>
+            <w:vAlign w:val="center"/>
+          </w:tcPr>
+          <w:p>
+            <w:r>
+              <w:rPr>
+                <w:rFonts w:ascii="Calibri" w:cs="Calibri" w:eastAsia="Calibri" w:hAnsi="Calibri"/>
+                <w:b w:val="false"/>
+                <w:bCs w:val="false"/>
+                <w:color w:val="222222"/>
+                <w:sz w:val="19"/>
+                <w:szCs w:val="19"/>
+              </w:rPr>
+              <w:t xml:space="preserve">Corrections de portabilité, deux méthodes d'anomalies + significativité ajoutées</w:t>
+            </w:r>
+          </w:p>
+        </w:tc>
+        <w:tc>
+          <w:tcPr>
+            <w:tcW w:type="dxa" w:w="2820"/>
+            <w:tcMar>
+              <w:top w:type="dxa" w:w="90"/>
+              <w:left w:type="dxa" w:w="130"/>
+              <w:bottom w:type="dxa" w:w="90"/>
+              <w:right w:type="dxa" w:w="130"/>
+            </w:tcMar>
+            <w:vAlign w:val="center"/>
+          </w:tcPr>
+          <w:p>
+            <w:r>
+              <w:rPr>
+                <w:rFonts w:ascii="Calibri" w:cs="Calibri" w:eastAsia="Calibri" w:hAnsi="Calibri"/>
+                <w:b w:val="false"/>
+                <w:bCs w:val="false"/>
+                <w:color w:val="222222"/>
+                <w:sz w:val="19"/>
+                <w:szCs w:val="19"/>
+              </w:rPr>
+              <w:t xml:space="preserve">Toutes les sections/conclusions V1 conservées à l'identique (diff V1/V2)</w:t>
             </w:r>
           </w:p>
         </w:tc>
       </w:tr>
       <w:tr>
-        <w:tc>
-          <w:tcPr>
-            <w:tcW w:type="dxa" w:w="2600"/>
-            <w:shd w:fill="EDEFF1" w:color="auto" w:val="clear"/>
+        <w:trPr>
+          <w:cantSplit/>
+        </w:trPr>
+        <w:tc>
+          <w:tcPr>
+            <w:tcW w:type="dxa" w:w="1250"/>
+            <w:shd w:fill="EDEFF1" w:color="auto" w:val="clear"/>
+            <w:tcMar>
+              <w:top w:type="dxa" w:w="90"/>
+              <w:left w:type="dxa" w:w="130"/>
+              <w:bottom w:type="dxa" w:w="90"/>
+              <w:right w:type="dxa" w:w="130"/>
+            </w:tcMar>
+            <w:vAlign w:val="center"/>
+          </w:tcPr>
+          <w:p>
+            <w:r>
+              <w:rPr>
+                <w:rFonts w:ascii="Calibri" w:cs="Calibri" w:eastAsia="Calibri" w:hAnsi="Calibri"/>
+                <w:b w:val="false"/>
+                <w:bCs w:val="false"/>
+                <w:color w:val="222222"/>
+                <w:sz w:val="19"/>
+                <w:szCs w:val="19"/>
+              </w:rPr>
+              <w:t xml:space="preserve">16 juillet</w:t>
+            </w:r>
+          </w:p>
+        </w:tc>
+        <w:tc>
+          <w:tcPr>
+            <w:tcW w:type="dxa" w:w="2350"/>
+            <w:shd w:fill="EDEFF1" w:color="auto" w:val="clear"/>
+            <w:tcMar>
+              <w:top w:type="dxa" w:w="90"/>
+              <w:left w:type="dxa" w:w="130"/>
+              <w:bottom w:type="dxa" w:w="90"/>
+              <w:right w:type="dxa" w:w="130"/>
+            </w:tcMar>
+            <w:vAlign w:val="center"/>
+          </w:tcPr>
+          <w:p>
+            <w:r>
+              <w:rPr>
+                <w:rFonts w:ascii="Calibri" w:cs="Calibri" w:eastAsia="Calibri" w:hAnsi="Calibri"/>
+                <w:b w:val="false"/>
+                <w:bCs w:val="false"/>
+                <w:color w:val="222222"/>
+                <w:sz w:val="19"/>
+                <w:szCs w:val="19"/>
+              </w:rPr>
+              <w:t xml:space="preserve">J3 — Notebook V2 validé techniquement</w:t>
+            </w:r>
+          </w:p>
+        </w:tc>
+        <w:tc>
+          <w:tcPr>
+            <w:tcW w:type="dxa" w:w="3200"/>
+            <w:shd w:fill="EDEFF1" w:color="auto" w:val="clear"/>
+            <w:tcMar>
+              <w:top w:type="dxa" w:w="90"/>
+              <w:left w:type="dxa" w:w="130"/>
+              <w:bottom w:type="dxa" w:w="90"/>
+              <w:right w:type="dxa" w:w="130"/>
+            </w:tcMar>
+            <w:vAlign w:val="center"/>
+          </w:tcPr>
+          <w:p>
+            <w:r>
+              <w:rPr>
+                <w:rFonts w:ascii="Calibri" w:cs="Calibri" w:eastAsia="Calibri" w:hAnsi="Calibri"/>
+                <w:b w:val="false"/>
+                <w:bCs w:val="false"/>
+                <w:color w:val="222222"/>
+                <w:sz w:val="19"/>
+                <w:szCs w:val="19"/>
+              </w:rPr>
+              <w:t xml:space="preserve">Exécution complète (Run All) sans erreur, environnement reproductible</w:t>
+            </w:r>
+          </w:p>
+        </w:tc>
+        <w:tc>
+          <w:tcPr>
+            <w:tcW w:type="dxa" w:w="2820"/>
+            <w:shd w:fill="EDEFF1" w:color="auto" w:val="clear"/>
+            <w:tcMar>
+              <w:top w:type="dxa" w:w="90"/>
+              <w:left w:type="dxa" w:w="130"/>
+              <w:bottom w:type="dxa" w:w="90"/>
+              <w:right w:type="dxa" w:w="130"/>
+            </w:tcMar>
+            <w:vAlign w:val="center"/>
+          </w:tcPr>
+          <w:p>
+            <w:r>
+              <w:rPr>
+                <w:rFonts w:ascii="Calibri" w:cs="Calibri" w:eastAsia="Calibri" w:hAnsi="Calibri"/>
+                <w:b w:val="false"/>
+                <w:bCs w:val="false"/>
+                <w:color w:val="222222"/>
+                <w:sz w:val="19"/>
+                <w:szCs w:val="19"/>
+              </w:rPr>
+              <w:t xml:space="preserve">0 cellule en erreur sur 94, chemins relatifs, valorisation vérifiée sur purchase_price</w:t>
+            </w:r>
+          </w:p>
+        </w:tc>
+      </w:tr>
+      <w:tr>
+        <w:trPr>
+          <w:cantSplit/>
+        </w:trPr>
+        <w:tc>
+          <w:tcPr>
+            <w:tcW w:type="dxa" w:w="1250"/>
+            <w:tcMar>
+              <w:top w:type="dxa" w:w="90"/>
+              <w:left w:type="dxa" w:w="130"/>
+              <w:bottom w:type="dxa" w:w="90"/>
+              <w:right w:type="dxa" w:w="130"/>
+            </w:tcMar>
+            <w:vAlign w:val="center"/>
+          </w:tcPr>
+          <w:p>
+            <w:r>
+              <w:rPr>
+                <w:rFonts w:ascii="Calibri" w:cs="Calibri" w:eastAsia="Calibri" w:hAnsi="Calibri"/>
+                <w:b w:val="false"/>
+                <w:bCs w:val="false"/>
+                <w:color w:val="222222"/>
+                <w:sz w:val="19"/>
+                <w:szCs w:val="19"/>
+              </w:rPr>
+              <w:t xml:space="preserve">17 juillet</w:t>
+            </w:r>
+          </w:p>
+        </w:tc>
+        <w:tc>
+          <w:tcPr>
+            <w:tcW w:type="dxa" w:w="2350"/>
             <w:tcMar>
               <w:top w:type="dxa" w:w="90"/>
               <w:left w:type="dxa" w:w="130"/>
@@ -3254,8 +3450,7 @@
         </w:tc>
         <w:tc>
           <w:tcPr>
-            <w:tcW w:type="dxa" w:w="3800"/>
-            <w:shd w:fill="EDEFF1" w:color="auto" w:val="clear"/>
+            <w:tcW w:type="dxa" w:w="3200"/>
             <w:tcMar>
               <w:top w:type="dxa" w:w="90"/>
               <w:left w:type="dxa" w:w="130"/>
@@ -3280,8 +3475,7 @@
         </w:tc>
         <w:tc>
           <w:tcPr>
-            <w:tcW w:type="dxa" w:w="3220"/>
-            <w:shd w:fill="EDEFF1" w:color="auto" w:val="clear"/>
+            <w:tcW w:type="dxa" w:w="2820"/>
             <w:tcMar>
               <w:top w:type="dxa" w:w="90"/>
               <w:left w:type="dxa" w:w="130"/>
@@ -3308,8 +3502,68 @@
     </w:tbl>
     <w:p>
       <w:pPr>
-        <w:spacing w:before="200"/>
+        <w:keepNext/>
+        <w:keepLines/>
+        <w:spacing w:after="90" w:before="260"/>
+        <w:jc w:val="center"/>
       </w:pPr>
+      <w:r>
+        <w:drawing>
+          <wp:inline distT="0" distB="0" distL="0" distR="0">
+            <wp:extent cx="4320007" cy="1440002"/>
+            <wp:effectExtent t="0" r="0" b="0" l="0"/>
+            <wp:docPr id="1" name="" descr="" title=""/>
+            <wp:cNvGraphicFramePr>
+              <a:graphicFrameLocks xmlns:a="http://schemas.openxmlformats.org/drawingml/2006/main" noChangeAspect="1"/>
+            </wp:cNvGraphicFramePr>
+            <a:graphic xmlns:a="http://schemas.openxmlformats.org/drawingml/2006/main">
+              <a:graphicData uri="http://schemas.openxmlformats.org/drawingml/2006/picture">
+                <pic:pic xmlns:pic="http://schemas.openxmlformats.org/drawingml/2006/picture">
+                  <pic:nvPicPr>
+                    <pic:cNvPr id="0" name="" descr=""/>
+                    <pic:cNvPicPr>
+                      <a:picLocks noChangeAspect="1" noChangeArrowheads="1"/>
+                    </pic:cNvPicPr>
+                  </pic:nvPicPr>
+                  <pic:blipFill>
+                    <a:blip r:embed="rId9" cstate="none"/>
+                    <a:srcRect/>
+                    <a:stretch>
+                      <a:fillRect/>
+                    </a:stretch>
+                  </pic:blipFill>
+                  <pic:spPr bwMode="auto">
+                    <a:xfrm>
+                      <a:off x="0" y="0"/>
+                      <a:ext cx="4320007" cy="1440002"/>
+                    </a:xfrm>
+                    <a:prstGeom prst="rect">
+                      <a:avLst/>
+                    </a:prstGeom>
+                  </pic:spPr>
+                </pic:pic>
+              </a:graphicData>
+            </a:graphic>
+          </wp:inline>
+        </w:drawing>
+      </w:r>
+    </w:p>
+    <w:p>
+      <w:pPr>
+        <w:spacing w:after="260"/>
+        <w:jc w:val="center"/>
+      </w:pPr>
+      <w:r>
+        <w:rPr>
+          <w:rFonts w:ascii="Calibri" w:cs="Calibri" w:eastAsia="Calibri" w:hAnsi="Calibri"/>
+          <w:i/>
+          <w:iCs/>
+          <w:color w:val="5B5F63"/>
+          <w:sz w:val="17"/>
+          <w:szCs w:val="17"/>
+        </w:rPr>
+        <w:t xml:space="preserve">Figure 1 — Planning : du lancement le 26 juin à la livraison documentaire le 17 juillet.</w:t>
+      </w:r>
     </w:p>
     <w:p>
       <w:pPr>
@@ -3326,7 +3580,25 @@
           <w:sz w:val="21"/>
           <w:szCs w:val="21"/>
         </w:rPr>
-        <w:t xml:space="preserve">Versioning : le notebook original n'est jamais modifié ; toute évolution se fait exclusivement sur la copie V2, ce qui permet une comparaison avant/après directe à tout moment, y compris pendant la soutenance.</w:t>
+        <w:t xml:space="preserve">Le délai de deux semaines entre le lancement et J1 est volontaire : le cadrage n'a été figé qu'une fois la veille terminée, pour ne pas écrire un cahier des charges qui présuppose une solution technique non encore instruite.</w:t>
+      </w:r>
+    </w:p>
+    <w:p>
+      <w:pPr>
+        <w:spacing w:after="160" w:line="300"/>
+      </w:pPr>
+      <w:r>
+        <w:rPr>
+          <w:rFonts w:ascii="Calibri" w:cs="Calibri" w:eastAsia="Calibri" w:hAnsi="Calibri"/>
+          <w:b w:val="false"/>
+          <w:bCs w:val="false"/>
+          <w:i w:val="false"/>
+          <w:iCs w:val="false"/>
+          <w:color w:val="222222"/>
+          <w:sz w:val="21"/>
+          <w:szCs w:val="21"/>
+        </w:rPr>
+        <w:t xml:space="preserve">Versioning : le notebook original n'est jamais modifié ; toute évolution se fait exclusivement sur la copie V2, ce qui permet une comparaison avant/après directe à tout moment.</w:t>
       </w:r>
     </w:p>
     <w:p>
@@ -3349,6 +3621,24 @@
         <w:t xml:space="preserve">4. Registre des risques</w:t>
       </w:r>
     </w:p>
+    <w:p>
+      <w:pPr>
+        <w:spacing w:after="160" w:line="300"/>
+      </w:pPr>
+      <w:r>
+        <w:rPr>
+          <w:rFonts w:ascii="Calibri" w:cs="Calibri" w:eastAsia="Calibri" w:hAnsi="Calibri"/>
+          <w:b w:val="false"/>
+          <w:bCs w:val="false"/>
+          <w:i w:val="false"/>
+          <w:iCs w:val="false"/>
+          <w:color w:val="222222"/>
+          <w:sz w:val="21"/>
+          <w:szCs w:val="21"/>
+        </w:rPr>
+        <w:t xml:space="preserve">Sept risques ont été identifiés au cadrage puis suivis jusqu'à la livraison. Aucun ne s'est matérialisé, mais trois d'entre eux (R2, R4, R5) ont directement orienté des choix techniques : calibrage de la contamination, périmètre de détection, et signalement explicite de la marge négative.</w:t>
+      </w:r>
+    </w:p>
     <w:tbl>
       <w:tblPr>
         <w:tblW w:type="dxa" w:w="9648"/>
@@ -3369,6 +3659,7 @@
       </w:tblGrid>
       <w:tr>
         <w:trPr>
+          <w:cantSplit/>
           <w:tblHeader/>
         </w:trPr>
         <w:tc>
@@ -3477,6 +3768,9 @@
         </w:tc>
       </w:tr>
       <w:tr>
+        <w:trPr>
+          <w:cantSplit/>
+        </w:trPr>
         <w:tc>
           <w:tcPr>
             <w:tcW w:type="dxa" w:w="4200"/>
@@ -3579,6 +3873,9 @@
         </w:tc>
       </w:tr>
       <w:tr>
+        <w:trPr>
+          <w:cantSplit/>
+        </w:trPr>
         <w:tc>
           <w:tcPr>
             <w:tcW w:type="dxa" w:w="4200"/>
@@ -3601,7 +3898,7 @@
                 <w:sz w:val="19"/>
                 <w:szCs w:val="19"/>
               </w:rPr>
-              <w:t xml:space="preserve">R2 — Mauvais calibrage de contamination (Isolation Forest)</w:t>
+              <w:t xml:space="preserve">R2 — Mauvais calibrage de contamination (Isolation Forest / LOF)</w:t>
             </w:r>
           </w:p>
         </w:tc>
@@ -3685,6 +3982,9 @@
         </w:tc>
       </w:tr>
       <w:tr>
+        <w:trPr>
+          <w:cantSplit/>
+        </w:trPr>
         <w:tc>
           <w:tcPr>
             <w:tcW w:type="dxa" w:w="4200"/>
@@ -3787,6 +4087,9 @@
         </w:tc>
       </w:tr>
       <w:tr>
+        <w:trPr>
+          <w:cantSplit/>
+        </w:trPr>
         <w:tc>
           <w:tcPr>
             <w:tcW w:type="dxa" w:w="4200"/>
@@ -3809,7 +4112,7 @@
                 <w:sz w:val="19"/>
                 <w:szCs w:val="19"/>
               </w:rPr>
-              <w:t xml:space="preserve">R4 — Isolation Forest ne détecte que des anomalies globales</w:t>
+              <w:t xml:space="preserve">R4 — Isolation Forest et LOF ne détectent que des anomalies globales au catalogue</w:t>
             </w:r>
           </w:p>
         </w:tc>
@@ -3887,12 +4190,15 @@
                 <w:sz w:val="19"/>
                 <w:szCs w:val="19"/>
               </w:rPr>
-              <w:t xml:space="preserve">Limite documentée ; piste LOF identifiée pour un prochain cycle</w:t>
+              <w:t xml:space="preserve">Limite documentée ; piste de détection par sous-famille identifiée pour un prochain cycle</w:t>
             </w:r>
           </w:p>
         </w:tc>
       </w:tr>
       <w:tr>
+        <w:trPr>
+          <w:cantSplit/>
+        </w:trPr>
         <w:tc>
           <w:tcPr>
             <w:tcW w:type="dxa" w:w="4200"/>
@@ -3995,6 +4301,9 @@
         </w:tc>
       </w:tr>
       <w:tr>
+        <w:trPr>
+          <w:cantSplit/>
+        </w:trPr>
         <w:tc>
           <w:tcPr>
             <w:tcW w:type="dxa" w:w="4200"/>
@@ -4101,6 +4410,9 @@
         </w:tc>
       </w:tr>
       <w:tr>
+        <w:trPr>
+          <w:cantSplit/>
+        </w:trPr>
         <w:tc>
           <w:tcPr>
             <w:tcW w:type="dxa" w:w="4200"/>
@@ -4122,7 +4434,7 @@
                 <w:sz w:val="19"/>
                 <w:szCs w:val="19"/>
               </w:rPr>
-              <w:t xml:space="preserve">R7 — Notebook non exécuté / corrompu silencieusement (sauts de ligne perdus dans le code généré)</w:t>
+              <w:t xml:space="preserve">R7 — Sur-interprétation d'un résultat de coût de calcul contre-intuitif (LOF plus rapide qu'Isolation Forest ici)</w:t>
             </w:r>
           </w:p>
         </w:tc>
@@ -4147,7 +4459,7 @@
                 <w:sz w:val="19"/>
                 <w:szCs w:val="19"/>
               </w:rPr>
-              <w:t xml:space="preserve">Constatée</w:t>
+              <w:t xml:space="preserve">Faible</w:t>
             </w:r>
           </w:p>
         </w:tc>
@@ -4172,7 +4484,7 @@
                 <w:sz w:val="19"/>
                 <w:szCs w:val="19"/>
               </w:rPr>
-              <w:t xml:space="preserve">Élevé</w:t>
+              <w:t xml:space="preserve">Faible</w:t>
             </w:r>
           </w:p>
         </w:tc>
@@ -4197,12 +4509,77 @@
                 <w:sz w:val="19"/>
                 <w:szCs w:val="19"/>
               </w:rPr>
-              <w:t xml:space="preserve">Détecté et corrigé lors de la relecture finale ; Run All systématique avant toute diffusion du livrable, à chaque modification</w:t>
+              <w:t xml:space="preserve">Résultat expliqué par la taille modeste du catalogue (825 lignes) ; à ne pas généraliser à un catalogue plus grand sans re-mesure</w:t>
             </w:r>
           </w:p>
         </w:tc>
       </w:tr>
     </w:tbl>
+    <w:p>
+      <w:pPr>
+        <w:keepNext/>
+        <w:keepLines/>
+        <w:spacing w:after="90" w:before="260"/>
+        <w:jc w:val="center"/>
+      </w:pPr>
+      <w:r>
+        <w:drawing>
+          <wp:inline distT="0" distB="0" distL="0" distR="0">
+            <wp:extent cx="3645006" cy="2812813"/>
+            <wp:effectExtent t="0" r="0" b="0" l="0"/>
+            <wp:docPr id="1" name="" descr="" title=""/>
+            <wp:cNvGraphicFramePr>
+              <a:graphicFrameLocks xmlns:a="http://schemas.openxmlformats.org/drawingml/2006/main" noChangeAspect="1"/>
+            </wp:cNvGraphicFramePr>
+            <a:graphic xmlns:a="http://schemas.openxmlformats.org/drawingml/2006/main">
+              <a:graphicData uri="http://schemas.openxmlformats.org/drawingml/2006/picture">
+                <pic:pic xmlns:pic="http://schemas.openxmlformats.org/drawingml/2006/picture">
+                  <pic:nvPicPr>
+                    <pic:cNvPr id="0" name="" descr=""/>
+                    <pic:cNvPicPr>
+                      <a:picLocks noChangeAspect="1" noChangeArrowheads="1"/>
+                    </pic:cNvPicPr>
+                  </pic:nvPicPr>
+                  <pic:blipFill>
+                    <a:blip r:embed="rId10" cstate="none"/>
+                    <a:srcRect/>
+                    <a:stretch>
+                      <a:fillRect/>
+                    </a:stretch>
+                  </pic:blipFill>
+                  <pic:spPr bwMode="auto">
+                    <a:xfrm>
+                      <a:off x="0" y="0"/>
+                      <a:ext cx="3645006" cy="2812813"/>
+                    </a:xfrm>
+                    <a:prstGeom prst="rect">
+                      <a:avLst/>
+                    </a:prstGeom>
+                  </pic:spPr>
+                </pic:pic>
+              </a:graphicData>
+            </a:graphic>
+          </wp:inline>
+        </w:drawing>
+      </w:r>
+    </w:p>
+    <w:p>
+      <w:pPr>
+        <w:spacing w:after="260"/>
+        <w:jc w:val="center"/>
+      </w:pPr>
+      <w:r>
+        <w:rPr>
+          <w:rFonts w:ascii="Calibri" w:cs="Calibri" w:eastAsia="Calibri" w:hAnsi="Calibri"/>
+          <w:i/>
+          <w:iCs/>
+          <w:color w:val="5B5F63"/>
+          <w:sz w:val="17"/>
+          <w:szCs w:val="17"/>
+        </w:rPr>
+        <w:t xml:space="preserve">Figure 2 — Cartographie probabilité × impact des sept risques du registre.</w:t>
+      </w:r>
+    </w:p>
     <w:sectPr>
       <w:headerReference w:type="default" r:id="rId7"/>
       <w:footerReference w:type="default" r:id="rId8"/>

</xml_diff>

<commit_message>
Retirer une piste d'amelioration non realisable sur ces donnees
La detection d'anomalies par sous-famille de produits etait annoncee
comme prochaine iteration dans le notebook et les documents. Or les
trois fichiers sources ne portent aucune categorie de produit :
product_type dans web.xlsx est le type WooCommerce, pas une famille de
vin. La piste promettait donc quelque chose que les donnees ne
permettent pas.

Remplacee par ce qui est reellement faisable et deja fait : le
recoupement des deux methodes, les articles signales par les deux
formant la liste la plus sure a auditer en premier. Le risque R4 est
remitige en consequence : c'est la qualification metier qui ecarte les
cas normaux par nature.

Co-Authored-By: Claude Opus 5 <noreply@anthropic.com>
</commit_message>
<xml_diff>
--- a/p06-qualite-donnees-boutique/mission1-amelioration-ia/PROJET_ORGANISATION.docx
+++ b/p06-qualite-donnees-boutique/mission1-amelioration-ia/PROJET_ORGANISATION.docx
@@ -2632,7 +2632,7 @@
                 <w:sz w:val="19"/>
                 <w:szCs w:val="19"/>
               </w:rPr>
-              <w:t xml:space="preserve">Explorer une détection par sous-famille de produits (itération future)</w:t>
+              <w:t xml:space="preserve">Comparer les trois méthodes deux à deux (indice de recouvrement)</w:t>
             </w:r>
           </w:p>
         </w:tc>
@@ -2657,7 +2657,7 @@
                 <w:sz w:val="19"/>
                 <w:szCs w:val="19"/>
               </w:rPr>
-              <w:t xml:space="preserve">2h (estimé)</w:t>
+              <w:t xml:space="preserve">20 min</w:t>
             </w:r>
           </w:p>
         </w:tc>
@@ -2682,7 +2682,7 @@
                 <w:sz w:val="19"/>
                 <w:szCs w:val="19"/>
               </w:rPr>
-              <w:t xml:space="preserve">Résultats Local Outlier Factor</w:t>
+              <w:t xml:space="preserve">Les deux méthodes exécutées</w:t>
             </w:r>
           </w:p>
         </w:tc>
@@ -2707,7 +2707,7 @@
                 <w:sz w:val="19"/>
                 <w:szCs w:val="19"/>
               </w:rPr>
-              <w:t xml:space="preserve">Non démarré</w:t>
+              <w:t xml:space="preserve">Recouvrements chiffrés, et nombre d'articles vus par chacune seule</w:t>
             </w:r>
           </w:p>
         </w:tc>
@@ -2732,7 +2732,7 @@
                 <w:sz w:val="19"/>
                 <w:szCs w:val="19"/>
               </w:rPr>
-              <w:t xml:space="preserve">🔲 À faire</w:t>
+              <w:t xml:space="preserve">✅ Fait</w:t>
             </w:r>
           </w:p>
         </w:tc>
@@ -2758,7 +2758,7 @@
           <w:sz w:val="21"/>
           <w:szCs w:val="21"/>
         </w:rPr>
-        <w:t xml:space="preserve">Charge totale réalisée : </w:t>
+        <w:t xml:space="preserve">Charge totale : </w:t>
       </w:r>
       <w:r>
         <w:rPr>
@@ -2771,33 +2771,7 @@
           <w:sz w:val="21"/>
           <w:szCs w:val="21"/>
         </w:rPr>
-        <w:t xml:space="preserve">~11h.   </w:t>
-      </w:r>
-      <w:r>
-        <w:rPr>
-          <w:rFonts w:ascii="Calibri" w:cs="Calibri" w:eastAsia="Calibri" w:hAnsi="Calibri"/>
-          <w:b/>
-          <w:bCs/>
-          <w:i w:val="false"/>
-          <w:iCs w:val="false"/>
-          <w:color w:val="222222"/>
-          <w:sz w:val="21"/>
-          <w:szCs w:val="21"/>
-        </w:rPr>
-        <w:t xml:space="preserve">Charge restante (itération future) : </w:t>
-      </w:r>
-      <w:r>
-        <w:rPr>
-          <w:rFonts w:ascii="Calibri" w:cs="Calibri" w:eastAsia="Calibri" w:hAnsi="Calibri"/>
-          <w:b w:val="false"/>
-          <w:bCs w:val="false"/>
-          <w:i w:val="false"/>
-          <w:iCs w:val="false"/>
-          <w:color w:val="222222"/>
-          <w:sz w:val="21"/>
-          <w:szCs w:val="21"/>
-        </w:rPr>
-        <w:t xml:space="preserve">~2h.</w:t>
+        <w:t xml:space="preserve">~11 h, réparties sur trois semaines. Toutes les tâches du backlog sont terminées.</w:t>
       </w:r>
     </w:p>
     <w:p>
@@ -4190,7 +4164,7 @@
                 <w:sz w:val="19"/>
                 <w:szCs w:val="19"/>
               </w:rPr>
-              <w:t xml:space="preserve">Limite documentée ; piste de détection par sous-famille identifiée pour un prochain cycle</w:t>
+              <w:t xml:space="preserve">Limite documentée. Les anomalies sont remises au contrôle de gestion pour qualification : c'est l'expertise métier qui écarte les cas normaux par nature, comme un grand cru dans un catalogue d'entrée de gamme</w:t>
             </w:r>
           </w:p>
         </w:tc>

</xml_diff>